<commit_message>
dbms expt 5 all question done happy ganesh chaturthi
</commit_message>
<xml_diff>
--- a/DBMS/EXP_5_DBMS_LAB_4_11_SEPTEMBER_2026.docx
+++ b/DBMS/EXP_5_DBMS_LAB_4_11_SEPTEMBER_2026.docx
@@ -1955,8 +1955,6 @@
           </wp:inline>
         </w:drawing>
       </w:r>
-      <w:bookmarkStart w:id="0" w:name="_GoBack"/>
-      <w:bookmarkEnd w:id="0"/>
     </w:p>
     <w:p>
       <w:pPr>
@@ -1978,7 +1976,64 @@
           <w:sz w:val="24"/>
           <w:szCs w:val="24"/>
         </w:rPr>
+        <w:lastRenderedPageBreak/>
         <w:t>Find all employees in the database who earn more than every employee of TCS</w:t>
+      </w:r>
+      <w:r>
+        <w:rPr>
+          <w:rFonts w:ascii="Times New Roman" w:hAnsi="Times New Roman" w:cs="Times New Roman"/>
+          <w:sz w:val="24"/>
+          <w:szCs w:val="24"/>
+        </w:rPr>
+        <w:t>:-</w:t>
+      </w:r>
+      <w:r>
+        <w:rPr>
+          <w:noProof/>
+        </w:rPr>
+        <w:t xml:space="preserve"> </w:t>
+      </w:r>
+      <w:r>
+        <w:rPr>
+          <w:rFonts w:ascii="Times New Roman" w:hAnsi="Times New Roman" w:cs="Times New Roman"/>
+          <w:sz w:val="24"/>
+          <w:szCs w:val="24"/>
+        </w:rPr>
+        <w:drawing>
+          <wp:inline distT="0" distB="0" distL="0" distR="0" wp14:anchorId="25640F63" wp14:editId="0AAF04E9">
+            <wp:extent cx="3162741" cy="2829320"/>
+            <wp:effectExtent l="0" t="0" r="0" b="9525"/>
+            <wp:docPr id="15" name="Picture 15"/>
+            <wp:cNvGraphicFramePr>
+              <a:graphicFrameLocks xmlns:a="http://schemas.openxmlformats.org/drawingml/2006/main" noChangeAspect="1"/>
+            </wp:cNvGraphicFramePr>
+            <a:graphic xmlns:a="http://schemas.openxmlformats.org/drawingml/2006/main">
+              <a:graphicData uri="http://schemas.openxmlformats.org/drawingml/2006/picture">
+                <pic:pic xmlns:pic="http://schemas.openxmlformats.org/drawingml/2006/picture">
+                  <pic:nvPicPr>
+                    <pic:cNvPr id="1" name=""/>
+                    <pic:cNvPicPr/>
+                  </pic:nvPicPr>
+                  <pic:blipFill>
+                    <a:blip r:embed="rId20"/>
+                    <a:stretch>
+                      <a:fillRect/>
+                    </a:stretch>
+                  </pic:blipFill>
+                  <pic:spPr>
+                    <a:xfrm>
+                      <a:off x="0" y="0"/>
+                      <a:ext cx="3162741" cy="2829320"/>
+                    </a:xfrm>
+                    <a:prstGeom prst="rect">
+                      <a:avLst/>
+                    </a:prstGeom>
+                  </pic:spPr>
+                </pic:pic>
+              </a:graphicData>
+            </a:graphic>
+          </wp:inline>
+        </w:drawing>
       </w:r>
     </w:p>
     <w:p>
@@ -2002,6 +2057,62 @@
         </w:rPr>
         <w:t>Find the company that has the smallest payroll</w:t>
       </w:r>
+      <w:r>
+        <w:rPr>
+          <w:rFonts w:ascii="Times New Roman" w:hAnsi="Times New Roman" w:cs="Times New Roman"/>
+          <w:sz w:val="24"/>
+          <w:szCs w:val="24"/>
+        </w:rPr>
+        <w:t>:-</w:t>
+      </w:r>
+      <w:r>
+        <w:rPr>
+          <w:noProof/>
+        </w:rPr>
+        <w:t xml:space="preserve"> </w:t>
+      </w:r>
+      <w:r>
+        <w:rPr>
+          <w:rFonts w:ascii="Times New Roman" w:hAnsi="Times New Roman" w:cs="Times New Roman"/>
+          <w:sz w:val="24"/>
+          <w:szCs w:val="24"/>
+        </w:rPr>
+        <w:drawing>
+          <wp:inline distT="0" distB="0" distL="0" distR="0" wp14:anchorId="78C4A2EA" wp14:editId="33D3760A">
+            <wp:extent cx="5943600" cy="675005"/>
+            <wp:effectExtent l="0" t="0" r="0" b="0"/>
+            <wp:docPr id="16" name="Picture 16"/>
+            <wp:cNvGraphicFramePr>
+              <a:graphicFrameLocks xmlns:a="http://schemas.openxmlformats.org/drawingml/2006/main" noChangeAspect="1"/>
+            </wp:cNvGraphicFramePr>
+            <a:graphic xmlns:a="http://schemas.openxmlformats.org/drawingml/2006/main">
+              <a:graphicData uri="http://schemas.openxmlformats.org/drawingml/2006/picture">
+                <pic:pic xmlns:pic="http://schemas.openxmlformats.org/drawingml/2006/picture">
+                  <pic:nvPicPr>
+                    <pic:cNvPr id="1" name=""/>
+                    <pic:cNvPicPr/>
+                  </pic:nvPicPr>
+                  <pic:blipFill>
+                    <a:blip r:embed="rId21"/>
+                    <a:stretch>
+                      <a:fillRect/>
+                    </a:stretch>
+                  </pic:blipFill>
+                  <pic:spPr>
+                    <a:xfrm>
+                      <a:off x="0" y="0"/>
+                      <a:ext cx="5943600" cy="675005"/>
+                    </a:xfrm>
+                    <a:prstGeom prst="rect">
+                      <a:avLst/>
+                    </a:prstGeom>
+                  </pic:spPr>
+                </pic:pic>
+              </a:graphicData>
+            </a:graphic>
+          </wp:inline>
+        </w:drawing>
+      </w:r>
     </w:p>
     <w:p>
       <w:pPr>
@@ -2040,7 +2151,55 @@
           <w:sz w:val="24"/>
           <w:szCs w:val="24"/>
         </w:rPr>
-        <w:t xml:space="preserve"> belongs to which employee. </w:t>
+        <w:t xml:space="preserve"> belongs to which employee:-</w:t>
+      </w:r>
+      <w:r>
+        <w:rPr>
+          <w:noProof/>
+        </w:rPr>
+        <w:t xml:space="preserve"> </w:t>
+      </w:r>
+      <w:r>
+        <w:rPr>
+          <w:rFonts w:ascii="Times New Roman" w:hAnsi="Times New Roman" w:cs="Times New Roman"/>
+          <w:sz w:val="24"/>
+          <w:szCs w:val="24"/>
+        </w:rPr>
+        <w:drawing>
+          <wp:inline distT="0" distB="0" distL="0" distR="0" wp14:anchorId="16095EE0" wp14:editId="477233D3">
+            <wp:extent cx="5943600" cy="1348740"/>
+            <wp:effectExtent l="0" t="0" r="0" b="3810"/>
+            <wp:docPr id="17" name="Picture 17"/>
+            <wp:cNvGraphicFramePr>
+              <a:graphicFrameLocks xmlns:a="http://schemas.openxmlformats.org/drawingml/2006/main" noChangeAspect="1"/>
+            </wp:cNvGraphicFramePr>
+            <a:graphic xmlns:a="http://schemas.openxmlformats.org/drawingml/2006/main">
+              <a:graphicData uri="http://schemas.openxmlformats.org/drawingml/2006/picture">
+                <pic:pic xmlns:pic="http://schemas.openxmlformats.org/drawingml/2006/picture">
+                  <pic:nvPicPr>
+                    <pic:cNvPr id="1" name=""/>
+                    <pic:cNvPicPr/>
+                  </pic:nvPicPr>
+                  <pic:blipFill>
+                    <a:blip r:embed="rId22"/>
+                    <a:stretch>
+                      <a:fillRect/>
+                    </a:stretch>
+                  </pic:blipFill>
+                  <pic:spPr>
+                    <a:xfrm>
+                      <a:off x="0" y="0"/>
+                      <a:ext cx="5943600" cy="1348740"/>
+                    </a:xfrm>
+                    <a:prstGeom prst="rect">
+                      <a:avLst/>
+                    </a:prstGeom>
+                  </pic:spPr>
+                </pic:pic>
+              </a:graphicData>
+            </a:graphic>
+          </wp:inline>
+        </w:drawing>
       </w:r>
     </w:p>
     <w:p>
@@ -2073,8 +2232,68 @@
           <w:szCs w:val="24"/>
           <w:lang w:val="en-IN"/>
         </w:rPr>
-        <w:t>Employees earning the highest salary in their company.</w:t>
-      </w:r>
+        <w:t xml:space="preserve">Employees earning the </w:t>
+      </w:r>
+      <w:r>
+        <w:rPr>
+          <w:rFonts w:ascii="Times New Roman" w:hAnsi="Times New Roman" w:cs="Times New Roman"/>
+          <w:sz w:val="24"/>
+          <w:szCs w:val="24"/>
+          <w:lang w:val="en-IN"/>
+        </w:rPr>
+        <w:t>highest salary in their company:-</w:t>
+      </w:r>
+      <w:r>
+        <w:rPr>
+          <w:noProof/>
+        </w:rPr>
+        <w:t xml:space="preserve"> </w:t>
+      </w:r>
+      <w:r>
+        <w:rPr>
+          <w:rFonts w:ascii="Times New Roman" w:hAnsi="Times New Roman" w:cs="Times New Roman"/>
+          <w:sz w:val="24"/>
+          <w:szCs w:val="24"/>
+          <w:lang w:val="en-IN"/>
+        </w:rPr>
+        <w:drawing>
+          <wp:inline distT="0" distB="0" distL="0" distR="0" wp14:anchorId="554CA9DF" wp14:editId="255E3D36">
+            <wp:extent cx="5943600" cy="944880"/>
+            <wp:effectExtent l="0" t="0" r="0" b="7620"/>
+            <wp:docPr id="18" name="Picture 18"/>
+            <wp:cNvGraphicFramePr>
+              <a:graphicFrameLocks xmlns:a="http://schemas.openxmlformats.org/drawingml/2006/main" noChangeAspect="1"/>
+            </wp:cNvGraphicFramePr>
+            <a:graphic xmlns:a="http://schemas.openxmlformats.org/drawingml/2006/main">
+              <a:graphicData uri="http://schemas.openxmlformats.org/drawingml/2006/picture">
+                <pic:pic xmlns:pic="http://schemas.openxmlformats.org/drawingml/2006/picture">
+                  <pic:nvPicPr>
+                    <pic:cNvPr id="1" name=""/>
+                    <pic:cNvPicPr/>
+                  </pic:nvPicPr>
+                  <pic:blipFill>
+                    <a:blip r:embed="rId23"/>
+                    <a:stretch>
+                      <a:fillRect/>
+                    </a:stretch>
+                  </pic:blipFill>
+                  <pic:spPr>
+                    <a:xfrm>
+                      <a:off x="0" y="0"/>
+                      <a:ext cx="5943600" cy="944880"/>
+                    </a:xfrm>
+                    <a:prstGeom prst="rect">
+                      <a:avLst/>
+                    </a:prstGeom>
+                  </pic:spPr>
+                </pic:pic>
+              </a:graphicData>
+            </a:graphic>
+          </wp:inline>
+        </w:drawing>
+      </w:r>
+      <w:bookmarkStart w:id="0" w:name="_GoBack"/>
+      <w:bookmarkEnd w:id="0"/>
     </w:p>
     <w:p>
       <w:pPr>

</xml_diff>